<commit_message>
chore(release): 發布可用版本 V1 (v1.0.0)
</commit_message>
<xml_diff>
--- a/恆逸_CompTIA_2027年1-6月課程.docx
+++ b/恆逸_CompTIA_2027年1-6月課程.docx
@@ -304,26 +304,28 @@
             <w:r>
               <w:rPr>
                 <w:rFonts w:cs="Arial" w:hint="eastAsia"/>
-                <w:sz w:val="20"/>
-                <w:szCs w:val="20"/>
-              </w:rPr>
-              <w:t>4</w:t>
-            </w:r>
-            <w:r>
-              <w:rPr>
-                <w:rFonts w:cs="Arial" w:hint="eastAsia"/>
-                <w:sz w:val="20"/>
-                <w:szCs w:val="20"/>
-              </w:rPr>
-              <w:t>2</w:t>
-            </w:r>
-            <w:r>
-              <w:rPr>
-                <w:rFonts w:cs="Arial"/>
-                <w:sz w:val="20"/>
-                <w:szCs w:val="20"/>
-              </w:rPr>
-              <w:t>,000</w:t>
+                <w:color w:val="EE0000"/>
+                <w:sz w:val="20"/>
+                <w:szCs w:val="20"/>
+              </w:rPr>
+              <w:t>25</w:t>
+            </w:r>
+            <w:r>
+              <w:rPr>
+                <w:rFonts w:cs="Arial"/>
+                <w:color w:val="EE0000"/>
+                <w:sz w:val="20"/>
+                <w:szCs w:val="20"/>
+              </w:rPr>
+              <w:t>,</w:t>
+            </w:r>
+            <w:r>
+              <w:rPr>
+                <w:rFonts w:cs="Arial"/>
+                <w:sz w:val="20"/>
+                <w:szCs w:val="20"/>
+              </w:rPr>
+              <w:t>000</w:t>
             </w:r>
             <w:r>
               <w:rPr>
@@ -2997,6 +2999,24 @@
                 <w:szCs w:val="20"/>
               </w:rPr>
               <w:t>（解釋網路安全概念）</w:t>
+            </w:r>
+            <w:r>
+              <w:rPr>
+                <w:rFonts w:cs="Arial" w:hint="eastAsia"/>
+                <w:color w:val="EE0000"/>
+                <w:sz w:val="20"/>
+                <w:szCs w:val="20"/>
+              </w:rPr>
+              <w:t>我是一個</w:t>
+            </w:r>
+            <w:r>
+              <w:rPr>
+                <w:rFonts w:cs="Arial" w:hint="eastAsia"/>
+                <w:color w:val="EE0000"/>
+                <w:sz w:val="20"/>
+                <w:szCs w:val="20"/>
+              </w:rPr>
+              <w:t>bug</w:t>
             </w:r>
           </w:p>
           <w:p>
@@ -4698,18 +4718,11 @@
             <w:r>
               <w:rPr>
                 <w:rFonts w:cs="Arial" w:hint="eastAsia"/>
-                <w:sz w:val="20"/>
-                <w:szCs w:val="20"/>
-              </w:rPr>
-              <w:t>1</w:t>
-            </w:r>
-            <w:r>
-              <w:rPr>
-                <w:rFonts w:cs="Arial"/>
-                <w:sz w:val="20"/>
-                <w:szCs w:val="20"/>
-              </w:rPr>
-              <w:t>3</w:t>
+                <w:color w:val="EE0000"/>
+                <w:sz w:val="20"/>
+                <w:szCs w:val="20"/>
+              </w:rPr>
+              <w:t>30</w:t>
             </w:r>
             <w:r>
               <w:rPr>
@@ -5570,6 +5583,42 @@
               <w:jc w:val="both"/>
               <w:rPr>
                 <w:rFonts w:cs="Arial"/>
+                <w:color w:val="EE0000"/>
+                <w:sz w:val="20"/>
+                <w:szCs w:val="20"/>
+              </w:rPr>
+            </w:pPr>
+            <w:r>
+              <w:rPr>
+                <w:rFonts w:cs="Arial" w:hint="eastAsia"/>
+                <w:color w:val="EE0000"/>
+                <w:sz w:val="20"/>
+                <w:szCs w:val="20"/>
+              </w:rPr>
+              <w:t>我是一個</w:t>
+            </w:r>
+            <w:r>
+              <w:rPr>
+                <w:rFonts w:cs="Arial" w:hint="eastAsia"/>
+                <w:color w:val="EE0000"/>
+                <w:sz w:val="20"/>
+                <w:szCs w:val="20"/>
+              </w:rPr>
+              <w:t>bug</w:t>
+            </w:r>
+          </w:p>
+          <w:p>
+            <w:pPr>
+              <w:pStyle w:val="afffc"/>
+              <w:numPr>
+                <w:ilvl w:val="0"/>
+                <w:numId w:val="22"/>
+              </w:numPr>
+              <w:spacing w:line="280" w:lineRule="exact"/>
+              <w:ind w:leftChars="0" w:left="400" w:hanging="400"/>
+              <w:jc w:val="both"/>
+              <w:rPr>
+                <w:rFonts w:cs="Arial"/>
                 <w:sz w:val="20"/>
                 <w:szCs w:val="20"/>
               </w:rPr>
@@ -6362,6 +6411,7 @@
                 <w:rFonts w:cs="Arial" w:hint="eastAsia"/>
                 <w:szCs w:val="18"/>
               </w:rPr>
+              <w:lastRenderedPageBreak/>
               <w:t>認識與了解資料保護與資料的合規性</w:t>
             </w:r>
           </w:p>
@@ -27642,7 +27692,7 @@
                               <w:sz w:val="16"/>
                               <w:szCs w:val="16"/>
                             </w:rPr>
-                            <w:t>2026/9/17</w:t>
+                            <w:t>2026/9/24</w:t>
                           </w:r>
                           <w:r>
                             <w:rPr>
@@ -28144,7 +28194,7 @@
                         <w:sz w:val="16"/>
                         <w:szCs w:val="16"/>
                       </w:rPr>
-                      <w:t>2026/9/17</w:t>
+                      <w:t>2026/9/24</w:t>
                     </w:r>
                     <w:r>
                       <w:rPr>
@@ -35498,10 +35548,6 @@
 </file>
 
 <file path=customXml/item1.xml><?xml version="1.0" encoding="utf-8"?>
-<LongProperties xmlns="http://schemas.microsoft.com/office/2006/metadata/longProperties"/>
-</file>
-
-<file path=customXml/item2.xml><?xml version="1.0" encoding="utf-8"?>
 <ct:contentTypeSchema xmlns:ct="http://schemas.microsoft.com/office/2006/metadata/contentType" xmlns:ma="http://schemas.microsoft.com/office/2006/metadata/properties/metaAttributes" ct:_="" ma:_="" ma:contentTypeName="Word 文件" ma:contentTypeID="0x0101005536309F2A458F4A99B5B6966ABA12AB00C7EE8CFCBF0E2D4789DE9D6AB2B132FF" ma:contentTypeVersion="5" ma:contentTypeDescription="新增 Word 文件" ma:contentTypeScope="" ma:versionID="4e298711203b5209f39c1c5b06983d35">
   <xsd:schema xmlns:xsd="http://www.w3.org/2001/XMLSchema" xmlns:p="http://schemas.microsoft.com/office/2006/metadata/properties" targetNamespace="http://schemas.microsoft.com/office/2006/metadata/properties" ma:root="true" ma:fieldsID="47ca070402944d25f5b7df1ddd38d0a7">
     <xsd:element name="properties">
@@ -35550,7 +35596,21 @@
 </ct:contentTypeSchema>
 </file>
 
+<file path=customXml/item2.xml><?xml version="1.0" encoding="utf-8"?>
+<LongProperties xmlns="http://schemas.microsoft.com/office/2006/metadata/longProperties"/>
+</file>
+
 <file path=customXml/item3.xml><?xml version="1.0" encoding="utf-8"?>
+<p:properties xmlns:p="http://schemas.microsoft.com/office/2006/metadata/properties" xmlns:xsi="http://www.w3.org/2001/XMLSchema-instance">
+  <documentManagement/>
+</p:properties>
+</file>
+
+<file path=customXml/item4.xml><?xml version="1.0" encoding="utf-8"?>
+<b:Sources xmlns:b="http://schemas.openxmlformats.org/officeDocument/2006/bibliography" xmlns="http://schemas.openxmlformats.org/officeDocument/2006/bibliography" SelectedStyle="\APA.XSL" StyleName="APA"/>
+</file>
+
+<file path=customXml/item5.xml><?xml version="1.0" encoding="utf-8"?>
 <?mso-contentType ?>
 <FormTemplates xmlns="http://schemas.microsoft.com/sharepoint/v3/contenttype/forms">
   <Display>DocumentLibraryForm</Display>
@@ -35559,25 +35619,7 @@
 </FormTemplates>
 </file>
 
-<file path=customXml/item4.xml><?xml version="1.0" encoding="utf-8"?>
-<b:Sources xmlns:b="http://schemas.openxmlformats.org/officeDocument/2006/bibliography" xmlns="http://schemas.openxmlformats.org/officeDocument/2006/bibliography" SelectedStyle="\APA.XSL" StyleName="APA"/>
-</file>
-
-<file path=customXml/item5.xml><?xml version="1.0" encoding="utf-8"?>
-<p:properties xmlns:p="http://schemas.microsoft.com/office/2006/metadata/properties" xmlns:xsi="http://www.w3.org/2001/XMLSchema-instance">
-  <documentManagement/>
-</p:properties>
-</file>
-
 <file path=customXml/itemProps1.xml><?xml version="1.0" encoding="utf-8"?>
-<ds:datastoreItem xmlns:ds="http://schemas.openxmlformats.org/officeDocument/2006/customXml" ds:itemID="{F00DE0AC-CFA4-4777-81C5-7AE4B621CD4B}">
-  <ds:schemaRefs>
-    <ds:schemaRef ds:uri="http://schemas.microsoft.com/office/2006/metadata/longProperties"/>
-  </ds:schemaRefs>
-</ds:datastoreItem>
-</file>
-
-<file path=customXml/itemProps2.xml><?xml version="1.0" encoding="utf-8"?>
 <ds:datastoreItem xmlns:ds="http://schemas.openxmlformats.org/officeDocument/2006/customXml" ds:itemID="{80E8DFD9-D458-4B81-AE76-52DC884AF91A}">
   <ds:schemaRefs>
     <ds:schemaRef ds:uri="http://schemas.microsoft.com/office/2006/metadata/contentType"/>
@@ -35592,10 +35634,18 @@
 </ds:datastoreItem>
 </file>
 
+<file path=customXml/itemProps2.xml><?xml version="1.0" encoding="utf-8"?>
+<ds:datastoreItem xmlns:ds="http://schemas.openxmlformats.org/officeDocument/2006/customXml" ds:itemID="{F00DE0AC-CFA4-4777-81C5-7AE4B621CD4B}">
+  <ds:schemaRefs>
+    <ds:schemaRef ds:uri="http://schemas.microsoft.com/office/2006/metadata/longProperties"/>
+  </ds:schemaRefs>
+</ds:datastoreItem>
+</file>
+
 <file path=customXml/itemProps3.xml><?xml version="1.0" encoding="utf-8"?>
-<ds:datastoreItem xmlns:ds="http://schemas.openxmlformats.org/officeDocument/2006/customXml" ds:itemID="{80926589-0C7E-404E-8B67-9A14C71A169C}">
+<ds:datastoreItem xmlns:ds="http://schemas.openxmlformats.org/officeDocument/2006/customXml" ds:itemID="{7297AEA5-479C-4D11-8AF7-071D85024213}">
   <ds:schemaRefs>
-    <ds:schemaRef ds:uri="http://schemas.microsoft.com/sharepoint/v3/contenttype/forms"/>
+    <ds:schemaRef ds:uri="http://schemas.microsoft.com/office/2006/metadata/properties"/>
   </ds:schemaRefs>
 </ds:datastoreItem>
 </file>
@@ -35609,9 +35659,9 @@
 </file>
 
 <file path=customXml/itemProps5.xml><?xml version="1.0" encoding="utf-8"?>
-<ds:datastoreItem xmlns:ds="http://schemas.openxmlformats.org/officeDocument/2006/customXml" ds:itemID="{7297AEA5-479C-4D11-8AF7-071D85024213}">
+<ds:datastoreItem xmlns:ds="http://schemas.openxmlformats.org/officeDocument/2006/customXml" ds:itemID="{80926589-0C7E-404E-8B67-9A14C71A169C}">
   <ds:schemaRefs>
-    <ds:schemaRef ds:uri="http://schemas.microsoft.com/office/2006/metadata/properties"/>
+    <ds:schemaRef ds:uri="http://schemas.microsoft.com/sharepoint/v3/contenttype/forms"/>
   </ds:schemaRefs>
 </ds:datastoreItem>
 </file>
</xml_diff>